<commit_message>
fix: add new module to architecture
</commit_message>
<xml_diff>
--- a/docs/semester-6/task4.docx
+++ b/docs/semester-6/task4.docx
@@ -163,83 +163,37 @@
       <w:pPr>
         <w:spacing w:after="120"/>
         <w:jc w:val="center"/>
-      </w:pPr>
-      <w:proofErr w:type="spellStart"/>
+        <w:rPr>
+          <w:lang w:val="ru-RU"/>
+        </w:rPr>
+      </w:pPr>
       <w:r>
         <w:rPr>
           <w:b/>
           <w:bCs/>
           <w:sz w:val="28"/>
           <w:szCs w:val="28"/>
-        </w:rPr>
-        <w:t>Отчет</w:t>
-      </w:r>
-      <w:proofErr w:type="spellEnd"/>
+          <w:lang w:val="ru-RU"/>
+        </w:rPr>
+        <w:t xml:space="preserve">Отчет по заданию </w:t>
+      </w:r>
       <w:r>
         <w:rPr>
           <w:b/>
           <w:bCs/>
           <w:sz w:val="28"/>
           <w:szCs w:val="28"/>
-        </w:rPr>
-        <w:t xml:space="preserve"> </w:t>
-      </w:r>
-      <w:proofErr w:type="spellStart"/>
+          <w:lang w:val="ru-RU"/>
+        </w:rPr>
+        <w:t>№</w:t>
+      </w:r>
       <w:r>
         <w:rPr>
           <w:b/>
           <w:bCs/>
           <w:sz w:val="28"/>
           <w:szCs w:val="28"/>
-        </w:rPr>
-        <w:t>по</w:t>
-      </w:r>
-      <w:proofErr w:type="spellEnd"/>
-      <w:r>
-        <w:rPr>
-          <w:b/>
-          <w:bCs/>
-          <w:sz w:val="28"/>
-          <w:szCs w:val="28"/>
-        </w:rPr>
-        <w:t xml:space="preserve"> </w:t>
-      </w:r>
-      <w:proofErr w:type="spellStart"/>
-      <w:r>
-        <w:rPr>
-          <w:b/>
-          <w:bCs/>
-          <w:sz w:val="28"/>
-          <w:szCs w:val="28"/>
-        </w:rPr>
-        <w:t>заданию</w:t>
-      </w:r>
-      <w:proofErr w:type="spellEnd"/>
-      <w:r>
-        <w:rPr>
-          <w:b/>
-          <w:bCs/>
-          <w:sz w:val="28"/>
-          <w:szCs w:val="28"/>
-        </w:rPr>
-        <w:t xml:space="preserve"> </w:t>
-      </w:r>
-      <w:r>
-        <w:rPr>
-          <w:b/>
-          <w:bCs/>
-          <w:sz w:val="28"/>
-          <w:szCs w:val="28"/>
-          <w:lang w:val="ru-RU"/>
-        </w:rPr>
-        <w:t>№</w:t>
-      </w:r>
-      <w:r>
-        <w:rPr>
-          <w:b/>
-          <w:bCs/>
-          <w:sz w:val="28"/>
-          <w:szCs w:val="28"/>
+          <w:lang w:val="ru-RU"/>
         </w:rPr>
         <w:t xml:space="preserve"> 4</w:t>
       </w:r>
@@ -1656,6 +1610,22 @@
               </w:rPr>
               <w:t>; буферизация измерений при потере связи.</w:t>
             </w:r>
+            <w:r>
+              <w:rPr>
+                <w:sz w:val="22"/>
+                <w:szCs w:val="22"/>
+                <w:lang w:val="ru-RU"/>
+              </w:rPr>
+              <w:t xml:space="preserve"> </w:t>
+            </w:r>
+            <w:r>
+              <w:rPr>
+                <w:sz w:val="22"/>
+                <w:szCs w:val="22"/>
+                <w:lang w:val="ru-RU"/>
+              </w:rPr>
+              <w:t>принимает настройки и команду внепланового опроса от сервера</w:t>
+            </w:r>
           </w:p>
         </w:tc>
         <w:tc>
@@ -1941,7 +1911,7 @@
                 <w:szCs w:val="22"/>
                 <w:lang w:val="ru-RU"/>
               </w:rPr>
-              <w:t xml:space="preserve">, сохраняет их в базе данных с меткой времени и зоной, сравнивает каждое </w:t>
+              <w:t xml:space="preserve">, сохраняет их в базе </w:t>
             </w:r>
             <w:r>
               <w:rPr>
@@ -1950,7 +1920,7 @@
                 <w:lang w:val="ru-RU"/>
               </w:rPr>
               <w:lastRenderedPageBreak/>
-              <w:t>значение с пороговым уровнем и формирует события-тревоги при превышении.</w:t>
+              <w:t>данных с меткой времени и зоной, сравнивает каждое значение с пороговым уровнем и формирует события-тревоги при превышении.</w:t>
             </w:r>
           </w:p>
         </w:tc>
@@ -2746,6 +2716,111 @@
                 <w:lang w:val="ru-RU"/>
               </w:rPr>
               <w:t>; все внутренние модули системы.</w:t>
+            </w:r>
+          </w:p>
+        </w:tc>
+      </w:tr>
+      <w:tr>
+        <w:tc>
+          <w:tcPr>
+            <w:tcW w:w="2800" w:type="dxa"/>
+          </w:tcPr>
+          <w:p>
+            <w:pPr>
+              <w:rPr>
+                <w:sz w:val="22"/>
+                <w:szCs w:val="22"/>
+                <w:lang w:val="ru-RU"/>
+              </w:rPr>
+            </w:pPr>
+            <w:r>
+              <w:rPr>
+                <w:sz w:val="22"/>
+                <w:szCs w:val="22"/>
+                <w:lang w:val="ru-RU"/>
+              </w:rPr>
+              <w:t>Веб-панель оператора и администратора</w:t>
+            </w:r>
+          </w:p>
+        </w:tc>
+        <w:tc>
+          <w:tcPr>
+            <w:tcW w:w="3280" w:type="dxa"/>
+          </w:tcPr>
+          <w:p>
+            <w:pPr>
+              <w:rPr>
+                <w:sz w:val="22"/>
+                <w:szCs w:val="22"/>
+                <w:lang w:val="ru-RU"/>
+              </w:rPr>
+            </w:pPr>
+            <w:r>
+              <w:rPr>
+                <w:sz w:val="22"/>
+                <w:szCs w:val="22"/>
+                <w:lang w:val="ru-RU"/>
+              </w:rPr>
+              <w:t>управление устройствами, статусы датчиков, заявки на обслуживание</w:t>
+            </w:r>
+          </w:p>
+        </w:tc>
+        <w:tc>
+          <w:tcPr>
+            <w:tcW w:w="3280" w:type="dxa"/>
+          </w:tcPr>
+          <w:p>
+            <w:pPr>
+              <w:rPr>
+                <w:sz w:val="22"/>
+                <w:szCs w:val="22"/>
+                <w:lang w:val="ru-RU"/>
+              </w:rPr>
+            </w:pPr>
+            <w:r>
+              <w:rPr>
+                <w:sz w:val="22"/>
+                <w:szCs w:val="22"/>
+              </w:rPr>
+              <w:t>Java</w:t>
+            </w:r>
+            <w:r>
+              <w:rPr>
+                <w:sz w:val="22"/>
+                <w:szCs w:val="22"/>
+                <w:lang w:val="ru-RU"/>
+              </w:rPr>
+              <w:t xml:space="preserve"> </w:t>
+            </w:r>
+            <w:r>
+              <w:rPr>
+                <w:sz w:val="22"/>
+                <w:szCs w:val="22"/>
+              </w:rPr>
+              <w:t>REST</w:t>
+            </w:r>
+            <w:r>
+              <w:rPr>
+                <w:sz w:val="22"/>
+                <w:szCs w:val="22"/>
+                <w:lang w:val="ru-RU"/>
+              </w:rPr>
+              <w:t xml:space="preserve"> </w:t>
+            </w:r>
+            <w:r>
+              <w:rPr>
+                <w:sz w:val="22"/>
+                <w:szCs w:val="22"/>
+              </w:rPr>
+              <w:t>API</w:t>
+            </w:r>
+            <w:r>
+              <w:rPr>
+                <w:sz w:val="22"/>
+                <w:szCs w:val="22"/>
+                <w:lang w:val="ru-RU"/>
+              </w:rPr>
+              <w:t xml:space="preserve"> и модулем авторизации</w:t>
             </w:r>
           </w:p>
         </w:tc>
@@ -3607,7 +3682,6 @@
   <w:style w:type="character" w:default="1" w:styleId="DefaultParagraphFont">
     <w:name w:val="Default Paragraph Font"/>
     <w:uiPriority w:val="1"/>
-    <w:semiHidden/>
     <w:unhideWhenUsed/>
   </w:style>
   <w:style w:type="table" w:default="1" w:styleId="TableNormal">

</xml_diff>